<commit_message>
Alinea diagramas y documentacion con Laravel y MariaDB
</commit_message>
<xml_diff>
--- a/teoria/documentacion/Diccionario_de_Datos_Villafane_corregido.docx
+++ b/teoria/documentacion/Diccionario_de_Datos_Villafane_corregido.docx
@@ -996,13 +996,14 @@
             <w:pPr>
               <w:jc w:val="left"/>
             </w:pPr>
-            <w:r/>
+            <w:r>
+              <w:t xml:space="preserve">    tipo_documento</w:t>
+            </w:r>
             <w:r>
               <w:rPr>
                 <w:b/>
                 <w:sz w:val="19"/>
               </w:rPr>
-              <w:t xml:space="preserve">    tipo_documento</w:t>
             </w:r>
           </w:p>
         </w:tc>
@@ -1015,13 +1016,14 @@
             <w:pPr>
               <w:jc w:val="left"/>
             </w:pPr>
-            <w:r/>
-            <w:r>
-              <w:rPr>
-                <w:b w:val="0"/>
-                <w:sz w:val="19"/>
-              </w:rPr>
+            <w:r>
               <w:t>ENUM</w:t>
+            </w:r>
+            <w:r>
+              <w:rPr>
+                <w:b w:val="0"/>
+                <w:sz w:val="19"/>
+              </w:rPr>
             </w:r>
           </w:p>
         </w:tc>
@@ -1034,13 +1036,14 @@
             <w:pPr>
               <w:jc w:val="left"/>
             </w:pPr>
-            <w:r/>
-            <w:r>
-              <w:rPr>
-                <w:b w:val="0"/>
-                <w:sz w:val="19"/>
-              </w:rPr>
+            <w:r>
               <w:t>NN</w:t>
+            </w:r>
+            <w:r>
+              <w:rPr>
+                <w:b w:val="0"/>
+                <w:sz w:val="19"/>
+              </w:rPr>
             </w:r>
           </w:p>
         </w:tc>
@@ -1053,13 +1056,14 @@
             <w:pPr>
               <w:jc w:val="left"/>
             </w:pPr>
-            <w:r/>
-            <w:r>
-              <w:rPr>
-                <w:b w:val="0"/>
-                <w:sz w:val="19"/>
-              </w:rPr>
+            <w:r>
               <w:t>NO</w:t>
+            </w:r>
+            <w:r>
+              <w:rPr>
+                <w:b w:val="0"/>
+                <w:sz w:val="19"/>
+              </w:rPr>
             </w:r>
           </w:p>
         </w:tc>
@@ -1072,13 +1076,14 @@
             <w:pPr>
               <w:jc w:val="left"/>
             </w:pPr>
-            <w:r/>
-            <w:r>
-              <w:rPr>
-                <w:b w:val="0"/>
-                <w:sz w:val="19"/>
-              </w:rPr>
-              <w:t>Tipo de documento de identidad. Valores: 'DNI' | 'CUIT' | 'Pasaporte'.</w:t>
+            <w:r>
+              <w:t>Tipo de documento. Valores: 'DNI' | 'CUIT' | 'CUIL'.</w:t>
+            </w:r>
+            <w:r>
+              <w:rPr>
+                <w:b w:val="0"/>
+                <w:sz w:val="19"/>
+              </w:rPr>
             </w:r>
           </w:p>
         </w:tc>
@@ -1287,13 +1292,14 @@
             <w:pPr>
               <w:jc w:val="left"/>
             </w:pPr>
-            <w:r/>
+            <w:r>
+              <w:t xml:space="preserve">    tipo_cliente</w:t>
+            </w:r>
             <w:r>
               <w:rPr>
                 <w:b/>
                 <w:sz w:val="19"/>
               </w:rPr>
-              <w:t xml:space="preserve">    tipo_cliente</w:t>
             </w:r>
           </w:p>
         </w:tc>
@@ -1306,13 +1312,14 @@
             <w:pPr>
               <w:jc w:val="left"/>
             </w:pPr>
-            <w:r/>
-            <w:r>
-              <w:rPr>
-                <w:b w:val="0"/>
-                <w:sz w:val="19"/>
-              </w:rPr>
+            <w:r>
               <w:t>ENUM</w:t>
+            </w:r>
+            <w:r>
+              <w:rPr>
+                <w:b w:val="0"/>
+                <w:sz w:val="19"/>
+              </w:rPr>
             </w:r>
           </w:p>
         </w:tc>
@@ -1325,13 +1332,14 @@
             <w:pPr>
               <w:jc w:val="left"/>
             </w:pPr>
-            <w:r/>
-            <w:r>
-              <w:rPr>
-                <w:b w:val="0"/>
-                <w:sz w:val="19"/>
-              </w:rPr>
+            <w:r>
               <w:t>NN</w:t>
+            </w:r>
+            <w:r>
+              <w:rPr>
+                <w:b w:val="0"/>
+                <w:sz w:val="19"/>
+              </w:rPr>
             </w:r>
           </w:p>
         </w:tc>
@@ -1344,13 +1352,14 @@
             <w:pPr>
               <w:jc w:val="left"/>
             </w:pPr>
-            <w:r/>
-            <w:r>
-              <w:rPr>
-                <w:b w:val="0"/>
-                <w:sz w:val="19"/>
-              </w:rPr>
+            <w:r>
               <w:t>NO</w:t>
+            </w:r>
+            <w:r>
+              <w:rPr>
+                <w:b w:val="0"/>
+                <w:sz w:val="19"/>
+              </w:rPr>
             </w:r>
           </w:p>
         </w:tc>
@@ -1363,13 +1372,14 @@
             <w:pPr>
               <w:jc w:val="left"/>
             </w:pPr>
-            <w:r/>
-            <w:r>
-              <w:rPr>
-                <w:b w:val="0"/>
-                <w:sz w:val="19"/>
-              </w:rPr>
-              <w:t>Categoría del cliente. Valores: 'particular' | 'empresa'.</w:t>
+            <w:r>
+              <w:t>Categoría. Valores: 'particular' | 'comercio'.</w:t>
+            </w:r>
+            <w:r>
+              <w:rPr>
+                <w:b w:val="0"/>
+                <w:sz w:val="19"/>
+              </w:rPr>
             </w:r>
           </w:p>
         </w:tc>
@@ -1768,13 +1778,14 @@
             <w:pPr>
               <w:jc w:val="left"/>
             </w:pPr>
-            <w:r/>
+            <w:r>
+              <w:t xml:space="preserve">    estado</w:t>
+            </w:r>
             <w:r>
               <w:rPr>
                 <w:b/>
                 <w:sz w:val="19"/>
               </w:rPr>
-              <w:t xml:space="preserve">    estado</w:t>
             </w:r>
           </w:p>
         </w:tc>
@@ -1787,13 +1798,14 @@
             <w:pPr>
               <w:jc w:val="left"/>
             </w:pPr>
-            <w:r/>
-            <w:r>
-              <w:rPr>
-                <w:b w:val="0"/>
-                <w:sz w:val="19"/>
-              </w:rPr>
+            <w:r>
               <w:t>ENUM</w:t>
+            </w:r>
+            <w:r>
+              <w:rPr>
+                <w:b w:val="0"/>
+                <w:sz w:val="19"/>
+              </w:rPr>
             </w:r>
           </w:p>
         </w:tc>
@@ -1806,13 +1818,14 @@
             <w:pPr>
               <w:jc w:val="left"/>
             </w:pPr>
-            <w:r/>
-            <w:r>
-              <w:rPr>
-                <w:b w:val="0"/>
-                <w:sz w:val="19"/>
-              </w:rPr>
+            <w:r>
               <w:t>NN</w:t>
+            </w:r>
+            <w:r>
+              <w:rPr>
+                <w:b w:val="0"/>
+                <w:sz w:val="19"/>
+              </w:rPr>
             </w:r>
           </w:p>
         </w:tc>
@@ -1825,13 +1838,14 @@
             <w:pPr>
               <w:jc w:val="left"/>
             </w:pPr>
-            <w:r/>
-            <w:r>
-              <w:rPr>
-                <w:b w:val="0"/>
-                <w:sz w:val="19"/>
-              </w:rPr>
+            <w:r>
               <w:t>NO</w:t>
+            </w:r>
+            <w:r>
+              <w:rPr>
+                <w:b w:val="0"/>
+                <w:sz w:val="19"/>
+              </w:rPr>
             </w:r>
           </w:p>
         </w:tc>
@@ -1844,13 +1858,14 @@
             <w:pPr>
               <w:jc w:val="left"/>
             </w:pPr>
-            <w:r/>
-            <w:r>
-              <w:rPr>
-                <w:b w:val="0"/>
-                <w:sz w:val="19"/>
-              </w:rPr>
-              <w:t>Estado del cliente. Valores: 'activo' | 'inactivo'.</w:t>
+            <w:r>
+              <w:t>Estado. Valores: 'activo' | 'suspendido' | 'baja'.</w:t>
+            </w:r>
+            <w:r>
+              <w:rPr>
+                <w:b w:val="0"/>
+                <w:sz w:val="19"/>
+              </w:rPr>
             </w:r>
           </w:p>
         </w:tc>
@@ -2391,13 +2406,14 @@
             <w:pPr>
               <w:jc w:val="left"/>
             </w:pPr>
-            <w:r/>
+            <w:r>
+              <w:t xml:space="preserve">    numero_instalacion</w:t>
+            </w:r>
             <w:r>
               <w:rPr>
                 <w:b/>
                 <w:sz w:val="19"/>
               </w:rPr>
-              <w:t xml:space="preserve">    numero_instalacion</w:t>
             </w:r>
           </w:p>
         </w:tc>
@@ -2410,13 +2426,14 @@
             <w:pPr>
               <w:jc w:val="left"/>
             </w:pPr>
-            <w:r/>
-            <w:r>
-              <w:rPr>
-                <w:b w:val="0"/>
-                <w:sz w:val="19"/>
-              </w:rPr>
+            <w:r>
               <w:t>VARCHAR(10)</w:t>
+            </w:r>
+            <w:r>
+              <w:rPr>
+                <w:b w:val="0"/>
+                <w:sz w:val="19"/>
+              </w:rPr>
             </w:r>
           </w:p>
         </w:tc>
@@ -2435,7 +2452,6 @@
                 <w:b w:val="0"/>
                 <w:sz w:val="19"/>
               </w:rPr>
-              <w:t>NN</w:t>
             </w:r>
           </w:p>
         </w:tc>
@@ -2448,13 +2464,14 @@
             <w:pPr>
               <w:jc w:val="left"/>
             </w:pPr>
-            <w:r/>
-            <w:r>
-              <w:rPr>
-                <w:b w:val="0"/>
-                <w:sz w:val="19"/>
-              </w:rPr>
-              <w:t>NO</w:t>
+            <w:r>
+              <w:t>SÍ</w:t>
+            </w:r>
+            <w:r>
+              <w:rPr>
+                <w:b w:val="0"/>
+                <w:sz w:val="19"/>
+              </w:rPr>
             </w:r>
           </w:p>
         </w:tc>
@@ -2467,13 +2484,14 @@
             <w:pPr>
               <w:jc w:val="left"/>
             </w:pPr>
-            <w:r/>
-            <w:r>
-              <w:rPr>
-                <w:b w:val="0"/>
-                <w:sz w:val="19"/>
-              </w:rPr>
-              <w:t>Número de puerta del domicilio de instalación.</w:t>
+            <w:r>
+              <w:t>Número de puerta; puede omitirse cuando la dirección no lo posee.</w:t>
+            </w:r>
+            <w:r>
+              <w:rPr>
+                <w:b w:val="0"/>
+                <w:sz w:val="19"/>
+              </w:rPr>
             </w:r>
           </w:p>
         </w:tc>
@@ -2682,13 +2700,14 @@
             <w:pPr>
               <w:jc w:val="left"/>
             </w:pPr>
-            <w:r/>
+            <w:r>
+              <w:t xml:space="preserve">    proximo_vencimiento</w:t>
+            </w:r>
             <w:r>
               <w:rPr>
                 <w:b/>
                 <w:sz w:val="19"/>
               </w:rPr>
-              <w:t xml:space="preserve">    proximo_vencimiento</w:t>
             </w:r>
           </w:p>
         </w:tc>
@@ -2701,13 +2720,14 @@
             <w:pPr>
               <w:jc w:val="left"/>
             </w:pPr>
-            <w:r/>
-            <w:r>
-              <w:rPr>
-                <w:b w:val="0"/>
-                <w:sz w:val="19"/>
-              </w:rPr>
+            <w:r>
               <w:t>DATE</w:t>
+            </w:r>
+            <w:r>
+              <w:rPr>
+                <w:b w:val="0"/>
+                <w:sz w:val="19"/>
+              </w:rPr>
             </w:r>
           </w:p>
         </w:tc>
@@ -2726,7 +2746,6 @@
                 <w:b w:val="0"/>
                 <w:sz w:val="19"/>
               </w:rPr>
-              <w:t>NN</w:t>
             </w:r>
           </w:p>
         </w:tc>
@@ -2739,13 +2758,14 @@
             <w:pPr>
               <w:jc w:val="left"/>
             </w:pPr>
-            <w:r/>
-            <w:r>
-              <w:rPr>
-                <w:b w:val="0"/>
-                <w:sz w:val="19"/>
-              </w:rPr>
-              <w:t>NO</w:t>
+            <w:r>
+              <w:t>SÍ</w:t>
+            </w:r>
+            <w:r>
+              <w:rPr>
+                <w:b w:val="0"/>
+                <w:sz w:val="19"/>
+              </w:rPr>
             </w:r>
           </w:p>
         </w:tc>
@@ -2758,13 +2778,14 @@
             <w:pPr>
               <w:jc w:val="left"/>
             </w:pPr>
-            <w:r/>
-            <w:r>
-              <w:rPr>
-                <w:b w:val="0"/>
-                <w:sz w:val="19"/>
-              </w:rPr>
-              <w:t>Fecha del próximo vencimiento de cuota, calculada automáticamente.</w:t>
+            <w:r>
+              <w:t>Próximo vencimiento pendiente; NULL cuando no existe una cuota futura.</w:t>
+            </w:r>
+            <w:r>
+              <w:rPr>
+                <w:b w:val="0"/>
+                <w:sz w:val="19"/>
+              </w:rPr>
             </w:r>
           </w:p>
         </w:tc>
@@ -2876,13 +2897,14 @@
             <w:pPr>
               <w:jc w:val="left"/>
             </w:pPr>
-            <w:r/>
+            <w:r>
+              <w:t xml:space="preserve">    ipv4</w:t>
+            </w:r>
             <w:r>
               <w:rPr>
                 <w:b/>
                 <w:sz w:val="19"/>
               </w:rPr>
-              <w:t xml:space="preserve">    ip</w:t>
             </w:r>
           </w:p>
         </w:tc>
@@ -2895,13 +2917,14 @@
             <w:pPr>
               <w:jc w:val="left"/>
             </w:pPr>
-            <w:r/>
-            <w:r>
-              <w:rPr>
-                <w:b w:val="0"/>
-                <w:sz w:val="19"/>
-              </w:rPr>
+            <w:r>
               <w:t>VARCHAR(15)</w:t>
+            </w:r>
+            <w:r>
+              <w:rPr>
+                <w:b w:val="0"/>
+                <w:sz w:val="19"/>
+              </w:rPr>
             </w:r>
           </w:p>
         </w:tc>
@@ -2932,13 +2955,14 @@
             <w:pPr>
               <w:jc w:val="left"/>
             </w:pPr>
-            <w:r/>
-            <w:r>
-              <w:rPr>
-                <w:b w:val="0"/>
-                <w:sz w:val="19"/>
-              </w:rPr>
+            <w:r>
               <w:t>SÍ</w:t>
+            </w:r>
+            <w:r>
+              <w:rPr>
+                <w:b w:val="0"/>
+                <w:sz w:val="19"/>
+              </w:rPr>
             </w:r>
           </w:p>
         </w:tc>
@@ -2951,13 +2975,14 @@
             <w:pPr>
               <w:jc w:val="left"/>
             </w:pPr>
-            <w:r/>
-            <w:r>
-              <w:rPr>
-                <w:b w:val="0"/>
-                <w:sz w:val="19"/>
-              </w:rPr>
-              <w:t>Dirección IP asignada al cliente (formato IPv4, ej. "192.168.1.10").</w:t>
+            <w:r>
+              <w:t>Dirección IPv4 asignada al equipo del cliente.</w:t>
+            </w:r>
+            <w:r>
+              <w:rPr>
+                <w:b w:val="0"/>
+                <w:sz w:val="19"/>
+              </w:rPr>
             </w:r>
           </w:p>
         </w:tc>
@@ -3977,6 +4002,58 @@
           </w:p>
         </w:tc>
       </w:tr>
+      <w:tr>
+        <w:tc>
+          <w:tcPr>
+            <w:tcW w:type="dxa" w:w="1824"/>
+          </w:tcPr>
+          <w:p>
+            <w:r>
+              <w:t xml:space="preserve">    estado</w:t>
+            </w:r>
+          </w:p>
+        </w:tc>
+        <w:tc>
+          <w:tcPr>
+            <w:tcW w:type="dxa" w:w="1824"/>
+          </w:tcPr>
+          <w:p>
+            <w:r>
+              <w:t>ENUM</w:t>
+            </w:r>
+          </w:p>
+        </w:tc>
+        <w:tc>
+          <w:tcPr>
+            <w:tcW w:type="dxa" w:w="1824"/>
+          </w:tcPr>
+          <w:p>
+            <w:r>
+              <w:t>NN</w:t>
+            </w:r>
+          </w:p>
+        </w:tc>
+        <w:tc>
+          <w:tcPr>
+            <w:tcW w:type="dxa" w:w="1824"/>
+          </w:tcPr>
+          <w:p>
+            <w:r>
+              <w:t>NO</w:t>
+            </w:r>
+          </w:p>
+        </w:tc>
+        <w:tc>
+          <w:tcPr>
+            <w:tcW w:type="dxa" w:w="1824"/>
+          </w:tcPr>
+          <w:p>
+            <w:r>
+              <w:t>Valores: 'pendiente' | 'pagada' | 'vencida'.</w:t>
+            </w:r>
+          </w:p>
+        </w:tc>
+      </w:tr>
     </w:tbl>
     <w:p/>
     <w:p>
@@ -4651,13 +4728,14 @@
             <w:pPr>
               <w:jc w:val="left"/>
             </w:pPr>
-            <w:r/>
+            <w:r>
+              <w:t>(PK) (FK) id_empleado</w:t>
+            </w:r>
             <w:r>
               <w:rPr>
                 <w:b/>
                 <w:sz w:val="19"/>
               </w:rPr>
-              <w:t>(PK) (FK) id_empleado</w:t>
             </w:r>
           </w:p>
         </w:tc>
@@ -4670,13 +4748,14 @@
             <w:pPr>
               <w:jc w:val="left"/>
             </w:pPr>
-            <w:r/>
-            <w:r>
-              <w:rPr>
-                <w:b w:val="0"/>
-                <w:sz w:val="19"/>
-              </w:rPr>
+            <w:r>
               <w:t>INT UNSIGNED</w:t>
+            </w:r>
+            <w:r>
+              <w:rPr>
+                <w:b w:val="0"/>
+                <w:sz w:val="19"/>
+              </w:rPr>
             </w:r>
           </w:p>
         </w:tc>
@@ -4689,13 +4768,14 @@
             <w:pPr>
               <w:jc w:val="left"/>
             </w:pPr>
-            <w:r/>
-            <w:r>
-              <w:rPr>
-                <w:b w:val="0"/>
-                <w:sz w:val="19"/>
-              </w:rPr>
+            <w:r>
               <w:t>PK · FK · NN</w:t>
+            </w:r>
+            <w:r>
+              <w:rPr>
+                <w:b w:val="0"/>
+                <w:sz w:val="19"/>
+              </w:rPr>
             </w:r>
           </w:p>
         </w:tc>
@@ -4708,13 +4788,14 @@
             <w:pPr>
               <w:jc w:val="left"/>
             </w:pPr>
-            <w:r/>
-            <w:r>
-              <w:rPr>
-                <w:b w:val="0"/>
-                <w:sz w:val="19"/>
-              </w:rPr>
+            <w:r>
               <w:t>NO</w:t>
+            </w:r>
+            <w:r>
+              <w:rPr>
+                <w:b w:val="0"/>
+                <w:sz w:val="19"/>
+              </w:rPr>
             </w:r>
           </w:p>
         </w:tc>
@@ -4727,13 +4808,14 @@
             <w:pPr>
               <w:jc w:val="left"/>
             </w:pPr>
-            <w:r/>
-            <w:r>
-              <w:rPr>
-                <w:b w:val="0"/>
-                <w:sz w:val="19"/>
-              </w:rPr>
-              <w:t>Identificador del empleado. PK y FK simultáneas → usuario.id_usuario (relación 1:1).</w:t>
+            <w:r>
+              <w:t>PK y FK simultáneas a usuario.id_usuario.</w:t>
+            </w:r>
+            <w:r>
+              <w:rPr>
+                <w:b w:val="0"/>
+                <w:sz w:val="19"/>
+              </w:rPr>
             </w:r>
           </w:p>
         </w:tc>
@@ -4748,13 +4830,14 @@
             <w:pPr>
               <w:jc w:val="left"/>
             </w:pPr>
-            <w:r/>
+            <w:r>
+              <w:t xml:space="preserve">    area</w:t>
+            </w:r>
             <w:r>
               <w:rPr>
                 <w:b/>
                 <w:sz w:val="19"/>
               </w:rPr>
-              <w:t xml:space="preserve">    area</w:t>
             </w:r>
           </w:p>
         </w:tc>
@@ -4767,13 +4850,14 @@
             <w:pPr>
               <w:jc w:val="left"/>
             </w:pPr>
-            <w:r/>
-            <w:r>
-              <w:rPr>
-                <w:b w:val="0"/>
-                <w:sz w:val="19"/>
-              </w:rPr>
+            <w:r>
               <w:t>VARCHAR(100)</w:t>
+            </w:r>
+            <w:r>
+              <w:rPr>
+                <w:b w:val="0"/>
+                <w:sz w:val="19"/>
+              </w:rPr>
             </w:r>
           </w:p>
         </w:tc>
@@ -4792,7 +4876,6 @@
                 <w:b w:val="0"/>
                 <w:sz w:val="19"/>
               </w:rPr>
-              <w:t>NN</w:t>
             </w:r>
           </w:p>
         </w:tc>
@@ -4805,13 +4888,14 @@
             <w:pPr>
               <w:jc w:val="left"/>
             </w:pPr>
-            <w:r/>
-            <w:r>
-              <w:rPr>
-                <w:b w:val="0"/>
-                <w:sz w:val="19"/>
-              </w:rPr>
-              <w:t>NO</w:t>
+            <w:r>
+              <w:t>SÍ</w:t>
+            </w:r>
+            <w:r>
+              <w:rPr>
+                <w:b w:val="0"/>
+                <w:sz w:val="19"/>
+              </w:rPr>
             </w:r>
           </w:p>
         </w:tc>
@@ -4824,13 +4908,14 @@
             <w:pPr>
               <w:jc w:val="left"/>
             </w:pPr>
-            <w:r/>
-            <w:r>
-              <w:rPr>
-                <w:b w:val="0"/>
-                <w:sz w:val="19"/>
-              </w:rPr>
-              <w:t>Área o departamento al que pertenece (ej. "Soporte Técnico", "Atención al Cliente").</w:t>
+            <w:r>
+              <w:t>Área del empleado; opcional al crear el perfil.</w:t>
+            </w:r>
+            <w:r>
+              <w:rPr>
+                <w:b w:val="0"/>
+                <w:sz w:val="19"/>
+              </w:rPr>
             </w:r>
           </w:p>
         </w:tc>
@@ -4845,13 +4930,14 @@
             <w:pPr>
               <w:jc w:val="left"/>
             </w:pPr>
-            <w:r/>
+            <w:r>
+              <w:t xml:space="preserve">    cargo</w:t>
+            </w:r>
             <w:r>
               <w:rPr>
                 <w:b/>
                 <w:sz w:val="19"/>
               </w:rPr>
-              <w:t xml:space="preserve">    cargo</w:t>
             </w:r>
           </w:p>
         </w:tc>
@@ -4864,13 +4950,14 @@
             <w:pPr>
               <w:jc w:val="left"/>
             </w:pPr>
-            <w:r/>
-            <w:r>
-              <w:rPr>
-                <w:b w:val="0"/>
-                <w:sz w:val="19"/>
-              </w:rPr>
+            <w:r>
               <w:t>VARCHAR(100)</w:t>
+            </w:r>
+            <w:r>
+              <w:rPr>
+                <w:b w:val="0"/>
+                <w:sz w:val="19"/>
+              </w:rPr>
             </w:r>
           </w:p>
         </w:tc>
@@ -4889,7 +4976,6 @@
                 <w:b w:val="0"/>
                 <w:sz w:val="19"/>
               </w:rPr>
-              <w:t>NN</w:t>
             </w:r>
           </w:p>
         </w:tc>
@@ -4902,13 +4988,14 @@
             <w:pPr>
               <w:jc w:val="left"/>
             </w:pPr>
-            <w:r/>
-            <w:r>
-              <w:rPr>
-                <w:b w:val="0"/>
-                <w:sz w:val="19"/>
-              </w:rPr>
-              <w:t>NO</w:t>
+            <w:r>
+              <w:t>SÍ</w:t>
+            </w:r>
+            <w:r>
+              <w:rPr>
+                <w:b w:val="0"/>
+                <w:sz w:val="19"/>
+              </w:rPr>
             </w:r>
           </w:p>
         </w:tc>
@@ -4921,13 +5008,14 @@
             <w:pPr>
               <w:jc w:val="left"/>
             </w:pPr>
-            <w:r/>
-            <w:r>
-              <w:rPr>
-                <w:b w:val="0"/>
-                <w:sz w:val="19"/>
-              </w:rPr>
-              <w:t>Cargo o puesto del empleado (ej. "Técnico", "Operador").</w:t>
+            <w:r>
+              <w:t>Cargo del empleado; opcional al crear el perfil.</w:t>
+            </w:r>
+            <w:r>
+              <w:rPr>
+                <w:b w:val="0"/>
+                <w:sz w:val="19"/>
+              </w:rPr>
             </w:r>
           </w:p>
         </w:tc>
@@ -4942,13 +5030,14 @@
             <w:pPr>
               <w:jc w:val="left"/>
             </w:pPr>
-            <w:r/>
+            <w:r>
+              <w:t xml:space="preserve">    turno</w:t>
+            </w:r>
             <w:r>
               <w:rPr>
                 <w:b/>
                 <w:sz w:val="19"/>
               </w:rPr>
-              <w:t xml:space="preserve">    turno</w:t>
             </w:r>
           </w:p>
         </w:tc>
@@ -4961,13 +5050,14 @@
             <w:pPr>
               <w:jc w:val="left"/>
             </w:pPr>
-            <w:r/>
-            <w:r>
-              <w:rPr>
-                <w:b w:val="0"/>
-                <w:sz w:val="19"/>
-              </w:rPr>
+            <w:r>
               <w:t>ENUM</w:t>
+            </w:r>
+            <w:r>
+              <w:rPr>
+                <w:b w:val="0"/>
+                <w:sz w:val="19"/>
+              </w:rPr>
             </w:r>
           </w:p>
         </w:tc>
@@ -4986,7 +5076,6 @@
                 <w:b w:val="0"/>
                 <w:sz w:val="19"/>
               </w:rPr>
-              <w:t>NN</w:t>
             </w:r>
           </w:p>
         </w:tc>
@@ -4999,13 +5088,14 @@
             <w:pPr>
               <w:jc w:val="left"/>
             </w:pPr>
-            <w:r/>
-            <w:r>
-              <w:rPr>
-                <w:b w:val="0"/>
-                <w:sz w:val="19"/>
-              </w:rPr>
-              <w:t>NO</w:t>
+            <w:r>
+              <w:t>SÍ</w:t>
+            </w:r>
+            <w:r>
+              <w:rPr>
+                <w:b w:val="0"/>
+                <w:sz w:val="19"/>
+              </w:rPr>
             </w:r>
           </w:p>
         </w:tc>
@@ -5018,13 +5108,14 @@
             <w:pPr>
               <w:jc w:val="left"/>
             </w:pPr>
-            <w:r/>
-            <w:r>
-              <w:rPr>
-                <w:b w:val="0"/>
-                <w:sz w:val="19"/>
-              </w:rPr>
-              <w:t>Turno de trabajo. Valores: 'mañana' | 'tarde' | 'noche'.</w:t>
+            <w:r>
+              <w:t>Valores: 'mañana' | 'tarde' | 'noche'.</w:t>
+            </w:r>
+            <w:r>
+              <w:rPr>
+                <w:b w:val="0"/>
+                <w:sz w:val="19"/>
+              </w:rPr>
             </w:r>
           </w:p>
         </w:tc>
@@ -5039,13 +5130,14 @@
             <w:pPr>
               <w:jc w:val="left"/>
             </w:pPr>
-            <w:r/>
+            <w:r>
+              <w:t xml:space="preserve">    fecha_ingreso</w:t>
+            </w:r>
             <w:r>
               <w:rPr>
                 <w:b/>
                 <w:sz w:val="19"/>
               </w:rPr>
-              <w:t xml:space="preserve">    fecha_ingreso</w:t>
             </w:r>
           </w:p>
         </w:tc>
@@ -5058,13 +5150,14 @@
             <w:pPr>
               <w:jc w:val="left"/>
             </w:pPr>
-            <w:r/>
-            <w:r>
-              <w:rPr>
-                <w:b w:val="0"/>
-                <w:sz w:val="19"/>
-              </w:rPr>
+            <w:r>
               <w:t>DATE</w:t>
+            </w:r>
+            <w:r>
+              <w:rPr>
+                <w:b w:val="0"/>
+                <w:sz w:val="19"/>
+              </w:rPr>
             </w:r>
           </w:p>
         </w:tc>
@@ -5083,7 +5176,6 @@
                 <w:b w:val="0"/>
                 <w:sz w:val="19"/>
               </w:rPr>
-              <w:t>NN</w:t>
             </w:r>
           </w:p>
         </w:tc>
@@ -5096,13 +5188,14 @@
             <w:pPr>
               <w:jc w:val="left"/>
             </w:pPr>
-            <w:r/>
-            <w:r>
-              <w:rPr>
-                <w:b w:val="0"/>
-                <w:sz w:val="19"/>
-              </w:rPr>
-              <w:t>NO</w:t>
+            <w:r>
+              <w:t>SÍ</w:t>
+            </w:r>
+            <w:r>
+              <w:rPr>
+                <w:b w:val="0"/>
+                <w:sz w:val="19"/>
+              </w:rPr>
             </w:r>
           </w:p>
         </w:tc>
@@ -5115,13 +5208,14 @@
             <w:pPr>
               <w:jc w:val="left"/>
             </w:pPr>
-            <w:r/>
-            <w:r>
-              <w:rPr>
-                <w:b w:val="0"/>
-                <w:sz w:val="19"/>
-              </w:rPr>
-              <w:t>Fecha en que el empleado se incorporó a la empresa.</w:t>
+            <w:r>
+              <w:t>Fecha de incorporación, si se conoce.</w:t>
+            </w:r>
+            <w:r>
+              <w:rPr>
+                <w:b w:val="0"/>
+                <w:sz w:val="19"/>
+              </w:rPr>
             </w:r>
           </w:p>
         </w:tc>
@@ -5376,13 +5470,14 @@
             <w:pPr>
               <w:jc w:val="left"/>
             </w:pPr>
-            <w:r/>
+            <w:r>
+              <w:t xml:space="preserve">    nivel_acceso</w:t>
+            </w:r>
             <w:r>
               <w:rPr>
                 <w:b/>
                 <w:sz w:val="19"/>
               </w:rPr>
-              <w:t xml:space="preserve">    nivel_acceso</w:t>
             </w:r>
           </w:p>
         </w:tc>
@@ -5395,13 +5490,14 @@
             <w:pPr>
               <w:jc w:val="left"/>
             </w:pPr>
-            <w:r/>
-            <w:r>
-              <w:rPr>
-                <w:b w:val="0"/>
-                <w:sz w:val="19"/>
-              </w:rPr>
+            <w:r>
               <w:t>ENUM</w:t>
+            </w:r>
+            <w:r>
+              <w:rPr>
+                <w:b w:val="0"/>
+                <w:sz w:val="19"/>
+              </w:rPr>
             </w:r>
           </w:p>
         </w:tc>
@@ -5414,13 +5510,14 @@
             <w:pPr>
               <w:jc w:val="left"/>
             </w:pPr>
-            <w:r/>
-            <w:r>
-              <w:rPr>
-                <w:b w:val="0"/>
-                <w:sz w:val="19"/>
-              </w:rPr>
+            <w:r>
               <w:t>NN</w:t>
+            </w:r>
+            <w:r>
+              <w:rPr>
+                <w:b w:val="0"/>
+                <w:sz w:val="19"/>
+              </w:rPr>
             </w:r>
           </w:p>
         </w:tc>
@@ -5433,13 +5530,14 @@
             <w:pPr>
               <w:jc w:val="left"/>
             </w:pPr>
-            <w:r/>
-            <w:r>
-              <w:rPr>
-                <w:b w:val="0"/>
-                <w:sz w:val="19"/>
-              </w:rPr>
+            <w:r>
               <w:t>NO</w:t>
+            </w:r>
+            <w:r>
+              <w:rPr>
+                <w:b w:val="0"/>
+                <w:sz w:val="19"/>
+              </w:rPr>
             </w:r>
           </w:p>
         </w:tc>
@@ -5452,13 +5550,14 @@
             <w:pPr>
               <w:jc w:val="left"/>
             </w:pPr>
-            <w:r/>
-            <w:r>
-              <w:rPr>
-                <w:b w:val="0"/>
-                <w:sz w:val="19"/>
-              </w:rPr>
-              <w:t>Nivel de acceso global. Valores: 'total' | 'limitado'.</w:t>
+            <w:r>
+              <w:t>Nivel global. Valores: 'total' | 'restringido'.</w:t>
+            </w:r>
+            <w:r>
+              <w:rPr>
+                <w:b w:val="0"/>
+                <w:sz w:val="19"/>
+              </w:rPr>
             </w:r>
           </w:p>
         </w:tc>
@@ -9316,13 +9415,14 @@
             <w:pPr>
               <w:jc w:val="left"/>
             </w:pPr>
-            <w:r/>
+            <w:r>
+              <w:t>(FK)  id_comprobante</w:t>
+            </w:r>
             <w:r>
               <w:rPr>
                 <w:b/>
                 <w:sz w:val="19"/>
               </w:rPr>
-              <w:t>(FK)  id_comprobante</w:t>
             </w:r>
           </w:p>
         </w:tc>
@@ -9335,13 +9435,14 @@
             <w:pPr>
               <w:jc w:val="left"/>
             </w:pPr>
-            <w:r/>
-            <w:r>
-              <w:rPr>
-                <w:b w:val="0"/>
-                <w:sz w:val="19"/>
-              </w:rPr>
+            <w:r>
               <w:t>INT UNSIGNED</w:t>
+            </w:r>
+            <w:r>
+              <w:rPr>
+                <w:b w:val="0"/>
+                <w:sz w:val="19"/>
+              </w:rPr>
             </w:r>
           </w:p>
         </w:tc>
@@ -9354,13 +9455,14 @@
             <w:pPr>
               <w:jc w:val="left"/>
             </w:pPr>
-            <w:r/>
-            <w:r>
-              <w:rPr>
-                <w:b w:val="0"/>
-                <w:sz w:val="19"/>
-              </w:rPr>
-              <w:t>FK · NN</w:t>
+            <w:r>
+              <w:t>UQ</w:t>
+            </w:r>
+            <w:r>
+              <w:rPr>
+                <w:b w:val="0"/>
+                <w:sz w:val="19"/>
+              </w:rPr>
             </w:r>
           </w:p>
         </w:tc>
@@ -9373,13 +9475,14 @@
             <w:pPr>
               <w:jc w:val="left"/>
             </w:pPr>
-            <w:r/>
-            <w:r>
-              <w:rPr>
-                <w:b w:val="0"/>
-                <w:sz w:val="19"/>
-              </w:rPr>
-              <w:t>NO</w:t>
+            <w:r>
+              <w:t>SÍ</w:t>
+            </w:r>
+            <w:r>
+              <w:rPr>
+                <w:b w:val="0"/>
+                <w:sz w:val="19"/>
+              </w:rPr>
             </w:r>
           </w:p>
         </w:tc>
@@ -9392,13 +9495,14 @@
             <w:pPr>
               <w:jc w:val="left"/>
             </w:pPr>
-            <w:r/>
-            <w:r>
-              <w:rPr>
-                <w:b w:val="0"/>
-                <w:sz w:val="19"/>
-              </w:rPr>
-              <w:t>Comprobante que originó el pago. Ref: comprobante.id_comprobante.</w:t>
+            <w:r>
+              <w:t>Comprobante de origen cuando existe; sin FK hasta incorporar su tabla.</w:t>
+            </w:r>
+            <w:r>
+              <w:rPr>
+                <w:b w:val="0"/>
+                <w:sz w:val="19"/>
+              </w:rPr>
             </w:r>
           </w:p>
         </w:tc>
@@ -9413,13 +9517,14 @@
             <w:pPr>
               <w:jc w:val="left"/>
             </w:pPr>
-            <w:r/>
+            <w:r>
+              <w:t>(FK)  id_cuenta</w:t>
+            </w:r>
             <w:r>
               <w:rPr>
                 <w:b/>
                 <w:sz w:val="19"/>
               </w:rPr>
-              <w:t>(FK)  id_cuenta</w:t>
             </w:r>
           </w:p>
         </w:tc>
@@ -9432,13 +9537,14 @@
             <w:pPr>
               <w:jc w:val="left"/>
             </w:pPr>
-            <w:r/>
-            <w:r>
-              <w:rPr>
-                <w:b w:val="0"/>
-                <w:sz w:val="19"/>
-              </w:rPr>
+            <w:r>
               <w:t>INT UNSIGNED</w:t>
+            </w:r>
+            <w:r>
+              <w:rPr>
+                <w:b w:val="0"/>
+                <w:sz w:val="19"/>
+              </w:rPr>
             </w:r>
           </w:p>
         </w:tc>
@@ -9451,13 +9557,14 @@
             <w:pPr>
               <w:jc w:val="left"/>
             </w:pPr>
-            <w:r/>
-            <w:r>
-              <w:rPr>
-                <w:b w:val="0"/>
-                <w:sz w:val="19"/>
-              </w:rPr>
-              <w:t>FK</w:t>
+            <w:r>
+              <w:t>FK · NN</w:t>
+            </w:r>
+            <w:r>
+              <w:rPr>
+                <w:b w:val="0"/>
+                <w:sz w:val="19"/>
+              </w:rPr>
             </w:r>
           </w:p>
         </w:tc>
@@ -9470,13 +9577,14 @@
             <w:pPr>
               <w:jc w:val="left"/>
             </w:pPr>
-            <w:r/>
-            <w:r>
-              <w:rPr>
-                <w:b w:val="0"/>
-                <w:sz w:val="19"/>
-              </w:rPr>
-              <w:t>SÍ</w:t>
+            <w:r>
+              <w:t>NO</w:t>
+            </w:r>
+            <w:r>
+              <w:rPr>
+                <w:b w:val="0"/>
+                <w:sz w:val="19"/>
+              </w:rPr>
             </w:r>
           </w:p>
         </w:tc>
@@ -9489,13 +9597,14 @@
             <w:pPr>
               <w:jc w:val="left"/>
             </w:pPr>
-            <w:r/>
-            <w:r>
-              <w:rPr>
-                <w:b w:val="0"/>
-                <w:sz w:val="19"/>
-              </w:rPr>
-              <w:t>Cuenta receptora donde se acreditó el pago. Ref: cuenta_receptora.id_cuenta. NULL si fue en efectivo.</w:t>
+            <w:r>
+              <w:t>Cuenta que recibe el pago. Ref: cuenta_receptora.id_cuenta.</w:t>
+            </w:r>
+            <w:r>
+              <w:rPr>
+                <w:b w:val="0"/>
+                <w:sz w:val="19"/>
+              </w:rPr>
             </w:r>
           </w:p>
         </w:tc>
@@ -9704,13 +9813,14 @@
             <w:pPr>
               <w:jc w:val="left"/>
             </w:pPr>
-            <w:r/>
+            <w:r>
+              <w:t xml:space="preserve">    medio_pago</w:t>
+            </w:r>
             <w:r>
               <w:rPr>
                 <w:b/>
                 <w:sz w:val="19"/>
               </w:rPr>
-              <w:t xml:space="preserve">    medio_pago</w:t>
             </w:r>
           </w:p>
         </w:tc>
@@ -9723,13 +9833,14 @@
             <w:pPr>
               <w:jc w:val="left"/>
             </w:pPr>
-            <w:r/>
-            <w:r>
-              <w:rPr>
-                <w:b w:val="0"/>
-                <w:sz w:val="19"/>
-              </w:rPr>
+            <w:r>
               <w:t>ENUM</w:t>
+            </w:r>
+            <w:r>
+              <w:rPr>
+                <w:b w:val="0"/>
+                <w:sz w:val="19"/>
+              </w:rPr>
             </w:r>
           </w:p>
         </w:tc>
@@ -9742,13 +9853,14 @@
             <w:pPr>
               <w:jc w:val="left"/>
             </w:pPr>
-            <w:r/>
-            <w:r>
-              <w:rPr>
-                <w:b w:val="0"/>
-                <w:sz w:val="19"/>
-              </w:rPr>
+            <w:r>
               <w:t>NN</w:t>
+            </w:r>
+            <w:r>
+              <w:rPr>
+                <w:b w:val="0"/>
+                <w:sz w:val="19"/>
+              </w:rPr>
             </w:r>
           </w:p>
         </w:tc>
@@ -9761,13 +9873,14 @@
             <w:pPr>
               <w:jc w:val="left"/>
             </w:pPr>
-            <w:r/>
-            <w:r>
-              <w:rPr>
-                <w:b w:val="0"/>
-                <w:sz w:val="19"/>
-              </w:rPr>
+            <w:r>
               <w:t>NO</w:t>
+            </w:r>
+            <w:r>
+              <w:rPr>
+                <w:b w:val="0"/>
+                <w:sz w:val="19"/>
+              </w:rPr>
             </w:r>
           </w:p>
         </w:tc>
@@ -9780,13 +9893,14 @@
             <w:pPr>
               <w:jc w:val="left"/>
             </w:pPr>
-            <w:r/>
-            <w:r>
-              <w:rPr>
-                <w:b w:val="0"/>
-                <w:sz w:val="19"/>
-              </w:rPr>
-              <w:t>Canal de pago utilizado. Valores: 'transferencia' | 'efectivo' | 'billetera_virtual'.</w:t>
+            <w:r>
+              <w:t>Valores: 'transferencia' | 'efectivo' | 'mercado_pago' | 'uala' | 'otro'.</w:t>
+            </w:r>
+            <w:r>
+              <w:rPr>
+                <w:b w:val="0"/>
+                <w:sz w:val="19"/>
+              </w:rPr>
             </w:r>
           </w:p>
         </w:tc>
@@ -10133,13 +10247,14 @@
             <w:pPr>
               <w:jc w:val="left"/>
             </w:pPr>
-            <w:r/>
+            <w:r>
+              <w:t xml:space="preserve">    tipo</w:t>
+            </w:r>
             <w:r>
               <w:rPr>
                 <w:b/>
                 <w:sz w:val="19"/>
               </w:rPr>
-              <w:t xml:space="preserve">    tipo</w:t>
             </w:r>
           </w:p>
         </w:tc>
@@ -10152,13 +10267,14 @@
             <w:pPr>
               <w:jc w:val="left"/>
             </w:pPr>
-            <w:r/>
-            <w:r>
-              <w:rPr>
-                <w:b w:val="0"/>
-                <w:sz w:val="19"/>
-              </w:rPr>
+            <w:r>
               <w:t>ENUM</w:t>
+            </w:r>
+            <w:r>
+              <w:rPr>
+                <w:b w:val="0"/>
+                <w:sz w:val="19"/>
+              </w:rPr>
             </w:r>
           </w:p>
         </w:tc>
@@ -10171,13 +10287,14 @@
             <w:pPr>
               <w:jc w:val="left"/>
             </w:pPr>
-            <w:r/>
-            <w:r>
-              <w:rPr>
-                <w:b w:val="0"/>
-                <w:sz w:val="19"/>
-              </w:rPr>
+            <w:r>
               <w:t>NN</w:t>
+            </w:r>
+            <w:r>
+              <w:rPr>
+                <w:b w:val="0"/>
+                <w:sz w:val="19"/>
+              </w:rPr>
             </w:r>
           </w:p>
         </w:tc>
@@ -10190,13 +10307,14 @@
             <w:pPr>
               <w:jc w:val="left"/>
             </w:pPr>
-            <w:r/>
-            <w:r>
-              <w:rPr>
-                <w:b w:val="0"/>
-                <w:sz w:val="19"/>
-              </w:rPr>
+            <w:r>
               <w:t>NO</w:t>
+            </w:r>
+            <w:r>
+              <w:rPr>
+                <w:b w:val="0"/>
+                <w:sz w:val="19"/>
+              </w:rPr>
             </w:r>
           </w:p>
         </w:tc>
@@ -10209,13 +10327,14 @@
             <w:pPr>
               <w:jc w:val="left"/>
             </w:pPr>
-            <w:r/>
-            <w:r>
-              <w:rPr>
-                <w:b w:val="0"/>
-                <w:sz w:val="19"/>
-              </w:rPr>
-              <w:t>Tipo de cuenta. Valores: 'banco' | 'billetera_virtual'.</w:t>
+            <w:r>
+              <w:t>Valores: 'banco' | 'mercado_pago' | 'uala' | 'otro'.</w:t>
+            </w:r>
+            <w:r>
+              <w:rPr>
+                <w:b w:val="0"/>
+                <w:sz w:val="19"/>
+              </w:rPr>
             </w:r>
           </w:p>
         </w:tc>

</xml_diff>